<commit_message>
Correction manque de leçon
</commit_message>
<xml_diff>
--- a/Cours/6eme/SaintExupery/Chapitre_3_1/Documents/Chapitre 3 - Partie 1 - Fraction partage et repérage (A trou).docx
+++ b/Cours/6eme/SaintExupery/Chapitre_3_1/Documents/Chapitre 3 - Partie 1 - Fraction partage et repérage (A trou).docx
@@ -1652,21 +1652,391 @@
         </w:tabs>
         <w:spacing w:before="240" w:after="0"/>
         <w:rPr>
-          <w:rFonts w:eastAsiaTheme="minorEastAsia"/>
-          <w:noProof/>
-          <w:szCs w:val="24"/>
-          <w:u w:val="dash"/>
-        </w:rPr>
-      </w:pPr>
-      <w:r>
-        <w:rPr>
           <w:sz w:val="24"/>
           <w:szCs w:val="24"/>
           <w:u w:val="dash"/>
         </w:rPr>
+      </w:pPr>
+      <w:r>
+        <w:rPr>
+          <w:sz w:val="24"/>
+          <w:szCs w:val="24"/>
+          <w:u w:val="dash"/>
+        </w:rPr>
         <w:tab/>
       </w:r>
     </w:p>
+    <w:p>
+      <w:pPr>
+        <w:spacing w:before="240"/>
+        <w:rPr>
+          <w:rStyle w:val="Accentuationlgre"/>
+          <w:sz w:val="24"/>
+          <w:szCs w:val="24"/>
+        </w:rPr>
+      </w:pPr>
+      <w:r>
+        <w:rPr>
+          <w:rStyle w:val="Accentuationlgre"/>
+          <w:sz w:val="24"/>
+          <w:szCs w:val="24"/>
+        </w:rPr>
+        <w:lastRenderedPageBreak/>
+        <w:t>Remarque :</w:t>
+      </w:r>
+    </w:p>
+    <w:p>
+      <w:r>
+        <w:rPr>
+          <w:rFonts w:eastAsiaTheme="minorEastAsia"/>
+          <w:sz w:val="24"/>
+          <w:szCs w:val="24"/>
+        </w:rPr>
+        <w:t xml:space="preserve">Il est possible </w:t>
+      </w:r>
+      <w:r>
+        <w:t xml:space="preserve">d'écrire une fraction en </w:t>
+      </w:r>
+      <w:r>
+        <w:rPr>
+          <w:b/>
+          <w:bCs/>
+        </w:rPr>
+        <w:t>forme mixte</w:t>
+      </w:r>
+      <w:r>
+        <w:t>. Cela consiste à séparer la partie entière et la partie restante :</w:t>
+      </w:r>
+    </w:p>
+    <w:tbl>
+      <w:tblPr>
+        <w:tblStyle w:val="Grilledutableau"/>
+        <w:tblW w:w="0" w:type="auto"/>
+        <w:tblLook w:val="04A0" w:firstRow="1" w:lastRow="0" w:firstColumn="1" w:lastColumn="0" w:noHBand="0" w:noVBand="1"/>
+      </w:tblPr>
+      <w:tblGrid>
+        <w:gridCol w:w="907"/>
+        <w:gridCol w:w="340"/>
+        <w:gridCol w:w="340"/>
+        <w:gridCol w:w="340"/>
+        <w:gridCol w:w="340"/>
+        <w:gridCol w:w="340"/>
+        <w:gridCol w:w="340"/>
+        <w:gridCol w:w="340"/>
+        <w:gridCol w:w="340"/>
+        <w:gridCol w:w="340"/>
+        <w:gridCol w:w="340"/>
+        <w:gridCol w:w="340"/>
+        <w:gridCol w:w="340"/>
+        <w:gridCol w:w="340"/>
+        <w:gridCol w:w="340"/>
+        <w:gridCol w:w="340"/>
+        <w:gridCol w:w="340"/>
+        <w:gridCol w:w="340"/>
+        <w:gridCol w:w="340"/>
+        <w:gridCol w:w="340"/>
+        <w:gridCol w:w="340"/>
+        <w:gridCol w:w="1134"/>
+      </w:tblGrid>
+      <w:tr>
+        <w:trPr>
+          <w:trHeight w:val="340"/>
+        </w:trPr>
+        <w:tc>
+          <w:tcPr>
+            <w:tcW w:w="907" w:type="dxa"/>
+            <w:tcBorders>
+              <w:top w:val="nil"/>
+              <w:left w:val="nil"/>
+              <w:bottom w:val="nil"/>
+              <w:right w:val="single" w:sz="12" w:space="0" w:color="auto"/>
+            </w:tcBorders>
+            <w:vAlign w:val="center"/>
+          </w:tcPr>
+          <w:p>
+            <m:oMathPara>
+              <m:oMath>
+                <m:f>
+                  <m:fPr>
+                    <m:ctrlPr>
+                      <w:rPr>
+                        <w:rFonts w:ascii="Cambria Math" w:hAnsi="Cambria Math"/>
+                        <w:i/>
+                      </w:rPr>
+                    </m:ctrlPr>
+                  </m:fPr>
+                  <m:num>
+                    <m:r>
+                      <w:rPr>
+                        <w:rFonts w:ascii="Cambria Math" w:hAnsi="Cambria Math"/>
+                      </w:rPr>
+                      <m:t>17</m:t>
+                    </m:r>
+                  </m:num>
+                  <m:den>
+                    <m:r>
+                      <w:rPr>
+                        <w:rFonts w:ascii="Cambria Math" w:hAnsi="Cambria Math"/>
+                      </w:rPr>
+                      <m:t>6</m:t>
+                    </m:r>
+                  </m:den>
+                </m:f>
+                <m:r>
+                  <w:rPr>
+                    <w:rFonts w:ascii="Cambria Math" w:hAnsi="Cambria Math"/>
+                  </w:rPr>
+                  <m:t>=</m:t>
+                </m:r>
+              </m:oMath>
+            </m:oMathPara>
+          </w:p>
+        </w:tc>
+        <w:tc>
+          <w:tcPr>
+            <w:tcW w:w="340" w:type="dxa"/>
+            <w:tcBorders>
+              <w:top w:val="single" w:sz="12" w:space="0" w:color="auto"/>
+              <w:left w:val="single" w:sz="12" w:space="0" w:color="auto"/>
+              <w:bottom w:val="single" w:sz="12" w:space="0" w:color="auto"/>
+            </w:tcBorders>
+          </w:tcPr>
+          <w:p/>
+        </w:tc>
+        <w:tc>
+          <w:tcPr>
+            <w:tcW w:w="340" w:type="dxa"/>
+            <w:tcBorders>
+              <w:top w:val="single" w:sz="12" w:space="0" w:color="auto"/>
+              <w:bottom w:val="single" w:sz="12" w:space="0" w:color="auto"/>
+            </w:tcBorders>
+          </w:tcPr>
+          <w:p/>
+        </w:tc>
+        <w:tc>
+          <w:tcPr>
+            <w:tcW w:w="340" w:type="dxa"/>
+            <w:tcBorders>
+              <w:top w:val="single" w:sz="12" w:space="0" w:color="auto"/>
+              <w:bottom w:val="single" w:sz="12" w:space="0" w:color="auto"/>
+            </w:tcBorders>
+          </w:tcPr>
+          <w:p/>
+        </w:tc>
+        <w:tc>
+          <w:tcPr>
+            <w:tcW w:w="340" w:type="dxa"/>
+            <w:tcBorders>
+              <w:top w:val="single" w:sz="12" w:space="0" w:color="auto"/>
+              <w:bottom w:val="single" w:sz="12" w:space="0" w:color="auto"/>
+            </w:tcBorders>
+          </w:tcPr>
+          <w:p/>
+        </w:tc>
+        <w:tc>
+          <w:tcPr>
+            <w:tcW w:w="340" w:type="dxa"/>
+            <w:tcBorders>
+              <w:top w:val="single" w:sz="12" w:space="0" w:color="auto"/>
+              <w:bottom w:val="single" w:sz="12" w:space="0" w:color="auto"/>
+            </w:tcBorders>
+          </w:tcPr>
+          <w:p/>
+        </w:tc>
+        <w:tc>
+          <w:tcPr>
+            <w:tcW w:w="340" w:type="dxa"/>
+            <w:tcBorders>
+              <w:top w:val="single" w:sz="12" w:space="0" w:color="auto"/>
+              <w:bottom w:val="single" w:sz="12" w:space="0" w:color="auto"/>
+              <w:right w:val="single" w:sz="12" w:space="0" w:color="auto"/>
+            </w:tcBorders>
+          </w:tcPr>
+          <w:p/>
+        </w:tc>
+        <w:tc>
+          <w:tcPr>
+            <w:tcW w:w="340" w:type="dxa"/>
+            <w:tcBorders>
+              <w:top w:val="nil"/>
+              <w:left w:val="single" w:sz="12" w:space="0" w:color="auto"/>
+              <w:bottom w:val="nil"/>
+              <w:right w:val="single" w:sz="12" w:space="0" w:color="auto"/>
+            </w:tcBorders>
+          </w:tcPr>
+          <w:p/>
+        </w:tc>
+        <w:tc>
+          <w:tcPr>
+            <w:tcW w:w="340" w:type="dxa"/>
+            <w:tcBorders>
+              <w:top w:val="single" w:sz="12" w:space="0" w:color="auto"/>
+              <w:left w:val="single" w:sz="12" w:space="0" w:color="auto"/>
+              <w:bottom w:val="single" w:sz="12" w:space="0" w:color="auto"/>
+            </w:tcBorders>
+          </w:tcPr>
+          <w:p/>
+        </w:tc>
+        <w:tc>
+          <w:tcPr>
+            <w:tcW w:w="340" w:type="dxa"/>
+            <w:tcBorders>
+              <w:top w:val="single" w:sz="12" w:space="0" w:color="auto"/>
+              <w:bottom w:val="single" w:sz="12" w:space="0" w:color="auto"/>
+            </w:tcBorders>
+          </w:tcPr>
+          <w:p/>
+        </w:tc>
+        <w:tc>
+          <w:tcPr>
+            <w:tcW w:w="340" w:type="dxa"/>
+            <w:tcBorders>
+              <w:top w:val="single" w:sz="12" w:space="0" w:color="auto"/>
+              <w:bottom w:val="single" w:sz="12" w:space="0" w:color="auto"/>
+            </w:tcBorders>
+          </w:tcPr>
+          <w:p/>
+        </w:tc>
+        <w:tc>
+          <w:tcPr>
+            <w:tcW w:w="340" w:type="dxa"/>
+            <w:tcBorders>
+              <w:top w:val="single" w:sz="12" w:space="0" w:color="auto"/>
+              <w:bottom w:val="single" w:sz="12" w:space="0" w:color="auto"/>
+            </w:tcBorders>
+          </w:tcPr>
+          <w:p/>
+        </w:tc>
+        <w:tc>
+          <w:tcPr>
+            <w:tcW w:w="340" w:type="dxa"/>
+            <w:tcBorders>
+              <w:top w:val="single" w:sz="12" w:space="0" w:color="auto"/>
+              <w:bottom w:val="single" w:sz="12" w:space="0" w:color="auto"/>
+            </w:tcBorders>
+          </w:tcPr>
+          <w:p/>
+        </w:tc>
+        <w:tc>
+          <w:tcPr>
+            <w:tcW w:w="340" w:type="dxa"/>
+            <w:tcBorders>
+              <w:top w:val="single" w:sz="12" w:space="0" w:color="auto"/>
+              <w:bottom w:val="single" w:sz="12" w:space="0" w:color="auto"/>
+              <w:right w:val="single" w:sz="12" w:space="0" w:color="auto"/>
+            </w:tcBorders>
+          </w:tcPr>
+          <w:p/>
+        </w:tc>
+        <w:tc>
+          <w:tcPr>
+            <w:tcW w:w="340" w:type="dxa"/>
+            <w:tcBorders>
+              <w:top w:val="nil"/>
+              <w:left w:val="single" w:sz="12" w:space="0" w:color="auto"/>
+              <w:bottom w:val="nil"/>
+              <w:right w:val="single" w:sz="12" w:space="0" w:color="auto"/>
+            </w:tcBorders>
+          </w:tcPr>
+          <w:p/>
+        </w:tc>
+        <w:tc>
+          <w:tcPr>
+            <w:tcW w:w="340" w:type="dxa"/>
+            <w:tcBorders>
+              <w:top w:val="single" w:sz="12" w:space="0" w:color="auto"/>
+              <w:left w:val="single" w:sz="12" w:space="0" w:color="auto"/>
+              <w:bottom w:val="single" w:sz="12" w:space="0" w:color="auto"/>
+            </w:tcBorders>
+          </w:tcPr>
+          <w:p/>
+        </w:tc>
+        <w:tc>
+          <w:tcPr>
+            <w:tcW w:w="340" w:type="dxa"/>
+            <w:tcBorders>
+              <w:top w:val="single" w:sz="12" w:space="0" w:color="auto"/>
+              <w:left w:val="nil"/>
+              <w:bottom w:val="single" w:sz="12" w:space="0" w:color="auto"/>
+            </w:tcBorders>
+          </w:tcPr>
+          <w:p/>
+        </w:tc>
+        <w:tc>
+          <w:tcPr>
+            <w:tcW w:w="340" w:type="dxa"/>
+            <w:tcBorders>
+              <w:top w:val="single" w:sz="12" w:space="0" w:color="auto"/>
+              <w:left w:val="nil"/>
+              <w:bottom w:val="single" w:sz="12" w:space="0" w:color="auto"/>
+            </w:tcBorders>
+          </w:tcPr>
+          <w:p/>
+        </w:tc>
+        <w:tc>
+          <w:tcPr>
+            <w:tcW w:w="340" w:type="dxa"/>
+            <w:tcBorders>
+              <w:top w:val="single" w:sz="12" w:space="0" w:color="auto"/>
+              <w:left w:val="nil"/>
+              <w:bottom w:val="single" w:sz="12" w:space="0" w:color="auto"/>
+            </w:tcBorders>
+          </w:tcPr>
+          <w:p/>
+        </w:tc>
+        <w:tc>
+          <w:tcPr>
+            <w:tcW w:w="340" w:type="dxa"/>
+            <w:tcBorders>
+              <w:top w:val="single" w:sz="12" w:space="0" w:color="auto"/>
+              <w:left w:val="nil"/>
+              <w:bottom w:val="single" w:sz="12" w:space="0" w:color="auto"/>
+            </w:tcBorders>
+          </w:tcPr>
+          <w:p/>
+        </w:tc>
+        <w:tc>
+          <w:tcPr>
+            <w:tcW w:w="340" w:type="dxa"/>
+            <w:tcBorders>
+              <w:top w:val="single" w:sz="12" w:space="0" w:color="auto"/>
+              <w:left w:val="nil"/>
+              <w:bottom w:val="single" w:sz="12" w:space="0" w:color="auto"/>
+              <w:right w:val="single" w:sz="12" w:space="0" w:color="auto"/>
+            </w:tcBorders>
+          </w:tcPr>
+          <w:p/>
+        </w:tc>
+        <w:tc>
+          <w:tcPr>
+            <w:tcW w:w="1134" w:type="dxa"/>
+            <w:tcBorders>
+              <w:top w:val="nil"/>
+              <w:left w:val="single" w:sz="12" w:space="0" w:color="auto"/>
+              <w:bottom w:val="nil"/>
+              <w:right w:val="nil"/>
+            </w:tcBorders>
+            <w:vAlign w:val="center"/>
+          </w:tcPr>
+          <w:p>
+            <m:oMath>
+              <m:r>
+                <w:rPr>
+                  <w:rFonts w:ascii="Cambria Math" w:hAnsi="Cambria Math"/>
+                </w:rPr>
+                <m:t>=</m:t>
+              </m:r>
+            </m:oMath>
+            <w:r>
+              <w:rPr>
+                <w:rFonts w:eastAsiaTheme="minorEastAsia"/>
+              </w:rPr>
+              <w:t xml:space="preserve"> </w:t>
+            </w:r>
+          </w:p>
+        </w:tc>
+      </w:tr>
+    </w:tbl>
     <w:p/>
     <w:p>
       <w:pPr>
@@ -1676,7 +2046,6 @@
         </w:rPr>
       </w:pPr>
       <w:r>
-        <w:lastRenderedPageBreak/>
         <w:t>I</w:t>
       </w:r>
       <w:r>
@@ -1926,7 +2295,7 @@
           <w:lang w:eastAsia="fr-FR"/>
         </w:rPr>
         <w:drawing>
-          <wp:inline distT="0" distB="0" distL="0" distR="0" wp14:anchorId="2593F80E" wp14:editId="703D579D">
+          <wp:inline distT="0" distB="0" distL="0" distR="0" wp14:anchorId="2593F80E" wp14:editId="5DBC0549">
             <wp:extent cx="5748655" cy="563212"/>
             <wp:effectExtent l="0" t="0" r="0" b="8890"/>
             <wp:docPr id="33" name="Image 33"/>

</xml_diff>

<commit_message>
Ajout type de fractions
</commit_message>
<xml_diff>
--- a/Cours/6eme/SaintExupery/Chapitre_3_1/Documents/Chapitre 3 - Partie 1 - Fraction partage et repérage (A trou).docx
+++ b/Cours/6eme/SaintExupery/Chapitre_3_1/Documents/Chapitre 3 - Partie 1 - Fraction partage et repérage (A trou).docx
@@ -683,7 +683,119 @@
       </w:r>
     </w:p>
     <w:p/>
-    <w:p/>
+    <w:p>
+      <w:pPr>
+        <w:spacing w:before="100" w:beforeAutospacing="1" w:after="100" w:afterAutospacing="1" w:line="240" w:lineRule="auto"/>
+        <w:rPr>
+          <w:rFonts w:ascii="Times New Roman" w:eastAsia="Times New Roman" w:hAnsi="Times New Roman" w:cs="Times New Roman"/>
+          <w:sz w:val="24"/>
+          <w:szCs w:val="24"/>
+          <w:lang w:eastAsia="fr-FR"/>
+        </w:rPr>
+      </w:pPr>
+      <w:r>
+        <w:rPr>
+          <w:rFonts w:eastAsia="Times New Roman" w:cs="Times New Roman"/>
+          <w:b/>
+          <w:bCs/>
+          <w:i/>
+          <w:iCs/>
+          <w:sz w:val="24"/>
+          <w:szCs w:val="24"/>
+          <w:lang w:eastAsia="fr-FR"/>
+        </w:rPr>
+        <w:t>Remarque</w:t>
+      </w:r>
+      <w:r>
+        <w:rPr>
+          <w:rFonts w:ascii="Times New Roman" w:eastAsia="Times New Roman" w:hAnsi="Times New Roman" w:cs="Times New Roman"/>
+          <w:sz w:val="24"/>
+          <w:szCs w:val="24"/>
+          <w:lang w:eastAsia="fr-FR"/>
+        </w:rPr>
+        <w:t xml:space="preserve"> :</w:t>
+      </w:r>
+    </w:p>
+    <w:p>
+      <w:pPr>
+        <w:numPr>
+          <w:ilvl w:val="0"/>
+          <w:numId w:val="10"/>
+        </w:numPr>
+        <w:spacing w:before="100" w:beforeAutospacing="1" w:after="100" w:afterAutospacing="1"/>
+        <w:rPr>
+          <w:rFonts w:eastAsia="Times New Roman" w:cs="Times New Roman"/>
+          <w:lang w:eastAsia="fr-FR"/>
+        </w:rPr>
+      </w:pPr>
+      <w:r>
+        <w:rPr>
+          <w:rFonts w:eastAsia="Times New Roman" w:cs="Times New Roman"/>
+          <w:lang w:eastAsia="fr-FR"/>
+        </w:rPr>
+        <w:t>Une fraction peut représenter :</w:t>
+      </w:r>
+    </w:p>
+    <w:p>
+      <w:pPr>
+        <w:numPr>
+          <w:ilvl w:val="1"/>
+          <w:numId w:val="10"/>
+        </w:numPr>
+        <w:spacing w:before="100" w:beforeAutospacing="1" w:after="100" w:afterAutospacing="1"/>
+        <w:rPr>
+          <w:rFonts w:eastAsia="Times New Roman" w:cs="Times New Roman"/>
+          <w:lang w:eastAsia="fr-FR"/>
+        </w:rPr>
+      </w:pPr>
+      <w:r>
+        <w:rPr>
+          <w:rFonts w:eastAsia="Times New Roman" w:cs="Times New Roman"/>
+          <w:lang w:eastAsia="fr-FR"/>
+        </w:rPr>
+        <w:t>Un entier</w:t>
+      </w:r>
+    </w:p>
+    <w:p>
+      <w:pPr>
+        <w:numPr>
+          <w:ilvl w:val="1"/>
+          <w:numId w:val="10"/>
+        </w:numPr>
+        <w:spacing w:before="100" w:beforeAutospacing="1" w:after="100" w:afterAutospacing="1"/>
+        <w:rPr>
+          <w:rFonts w:eastAsia="Times New Roman" w:cs="Times New Roman"/>
+          <w:lang w:eastAsia="fr-FR"/>
+        </w:rPr>
+      </w:pPr>
+      <w:r>
+        <w:rPr>
+          <w:rFonts w:eastAsia="Times New Roman" w:cs="Times New Roman"/>
+          <w:lang w:eastAsia="fr-FR"/>
+        </w:rPr>
+        <w:t xml:space="preserve">Un nombre décimal </w:t>
+      </w:r>
+    </w:p>
+    <w:p>
+      <w:pPr>
+        <w:numPr>
+          <w:ilvl w:val="1"/>
+          <w:numId w:val="10"/>
+        </w:numPr>
+        <w:spacing w:before="100" w:beforeAutospacing="1" w:after="100" w:afterAutospacing="1"/>
+        <w:rPr>
+          <w:rFonts w:eastAsia="Times New Roman" w:cs="Times New Roman"/>
+          <w:lang w:eastAsia="fr-FR"/>
+        </w:rPr>
+      </w:pPr>
+      <w:r>
+        <w:rPr>
+          <w:rFonts w:eastAsia="Times New Roman" w:cs="Times New Roman"/>
+          <w:lang w:eastAsia="fr-FR"/>
+        </w:rPr>
+        <w:t xml:space="preserve">Un nombre non décimal </w:t>
+      </w:r>
+    </w:p>
     <w:p>
       <w:pPr>
         <w:pStyle w:val="Titre1"/>
@@ -1171,7 +1283,7 @@
     </w:p>
     <w:p>
       <w:pPr>
-        <w:spacing w:before="240" w:after="0"/>
+        <w:spacing w:after="0"/>
         <w:rPr>
           <w:sz w:val="24"/>
           <w:szCs w:val="24"/>
@@ -1432,8 +1544,8 @@
         <w:rPr>
           <w:rFonts w:eastAsiaTheme="minorEastAsia"/>
           <w:noProof/>
-          <w:sz w:val="24"/>
-          <w:szCs w:val="24"/>
+          <w:sz w:val="16"/>
+          <w:szCs w:val="16"/>
         </w:rPr>
       </w:pPr>
     </w:p>
@@ -1642,6 +1754,7 @@
           <w:szCs w:val="24"/>
           <w:u w:val="dash"/>
         </w:rPr>
+        <w:lastRenderedPageBreak/>
         <w:tab/>
       </w:r>
     </w:p>
@@ -1681,7 +1794,6 @@
           <w:sz w:val="24"/>
           <w:szCs w:val="24"/>
         </w:rPr>
-        <w:lastRenderedPageBreak/>
         <w:t>Remarque :</w:t>
       </w:r>
     </w:p>
@@ -2295,7 +2407,7 @@
           <w:lang w:eastAsia="fr-FR"/>
         </w:rPr>
         <w:drawing>
-          <wp:inline distT="0" distB="0" distL="0" distR="0" wp14:anchorId="2593F80E" wp14:editId="5DBC0549">
+          <wp:inline distT="0" distB="0" distL="0" distR="0" wp14:anchorId="2593F80E" wp14:editId="7A65CED4">
             <wp:extent cx="5748655" cy="563212"/>
             <wp:effectExtent l="0" t="0" r="0" b="8890"/>
             <wp:docPr id="33" name="Image 33"/>
@@ -4614,6 +4726,155 @@
     </w:lvl>
   </w:abstractNum>
   <w:abstractNum w:abstractNumId="7" w15:restartNumberingAfterBreak="0">
+    <w:nsid w:val="64847AFC"/>
+    <w:multiLevelType w:val="multilevel"/>
+    <w:tmpl w:val="E42055EA"/>
+    <w:lvl w:ilvl="0">
+      <w:start w:val="1"/>
+      <w:numFmt w:val="bullet"/>
+      <w:lvlText w:val=""/>
+      <w:lvlJc w:val="left"/>
+      <w:pPr>
+        <w:tabs>
+          <w:tab w:val="num" w:pos="720"/>
+        </w:tabs>
+        <w:ind w:left="720" w:hanging="360"/>
+      </w:pPr>
+      <w:rPr>
+        <w:rFonts w:ascii="Symbol" w:hAnsi="Symbol" w:hint="default"/>
+        <w:sz w:val="20"/>
+      </w:rPr>
+    </w:lvl>
+    <w:lvl w:ilvl="1">
+      <w:start w:val="1"/>
+      <w:numFmt w:val="bullet"/>
+      <w:lvlText w:val="o"/>
+      <w:lvlJc w:val="left"/>
+      <w:pPr>
+        <w:tabs>
+          <w:tab w:val="num" w:pos="1440"/>
+        </w:tabs>
+        <w:ind w:left="1440" w:hanging="360"/>
+      </w:pPr>
+      <w:rPr>
+        <w:rFonts w:ascii="Courier New" w:hAnsi="Courier New" w:hint="default"/>
+        <w:sz w:val="20"/>
+      </w:rPr>
+    </w:lvl>
+    <w:lvl w:ilvl="2" w:tentative="1">
+      <w:start w:val="1"/>
+      <w:numFmt w:val="bullet"/>
+      <w:lvlText w:val=""/>
+      <w:lvlJc w:val="left"/>
+      <w:pPr>
+        <w:tabs>
+          <w:tab w:val="num" w:pos="2160"/>
+        </w:tabs>
+        <w:ind w:left="2160" w:hanging="360"/>
+      </w:pPr>
+      <w:rPr>
+        <w:rFonts w:ascii="Wingdings" w:hAnsi="Wingdings" w:hint="default"/>
+        <w:sz w:val="20"/>
+      </w:rPr>
+    </w:lvl>
+    <w:lvl w:ilvl="3" w:tentative="1">
+      <w:start w:val="1"/>
+      <w:numFmt w:val="bullet"/>
+      <w:lvlText w:val=""/>
+      <w:lvlJc w:val="left"/>
+      <w:pPr>
+        <w:tabs>
+          <w:tab w:val="num" w:pos="2880"/>
+        </w:tabs>
+        <w:ind w:left="2880" w:hanging="360"/>
+      </w:pPr>
+      <w:rPr>
+        <w:rFonts w:ascii="Wingdings" w:hAnsi="Wingdings" w:hint="default"/>
+        <w:sz w:val="20"/>
+      </w:rPr>
+    </w:lvl>
+    <w:lvl w:ilvl="4" w:tentative="1">
+      <w:start w:val="1"/>
+      <w:numFmt w:val="bullet"/>
+      <w:lvlText w:val=""/>
+      <w:lvlJc w:val="left"/>
+      <w:pPr>
+        <w:tabs>
+          <w:tab w:val="num" w:pos="3600"/>
+        </w:tabs>
+        <w:ind w:left="3600" w:hanging="360"/>
+      </w:pPr>
+      <w:rPr>
+        <w:rFonts w:ascii="Wingdings" w:hAnsi="Wingdings" w:hint="default"/>
+        <w:sz w:val="20"/>
+      </w:rPr>
+    </w:lvl>
+    <w:lvl w:ilvl="5" w:tentative="1">
+      <w:start w:val="1"/>
+      <w:numFmt w:val="bullet"/>
+      <w:lvlText w:val=""/>
+      <w:lvlJc w:val="left"/>
+      <w:pPr>
+        <w:tabs>
+          <w:tab w:val="num" w:pos="4320"/>
+        </w:tabs>
+        <w:ind w:left="4320" w:hanging="360"/>
+      </w:pPr>
+      <w:rPr>
+        <w:rFonts w:ascii="Wingdings" w:hAnsi="Wingdings" w:hint="default"/>
+        <w:sz w:val="20"/>
+      </w:rPr>
+    </w:lvl>
+    <w:lvl w:ilvl="6" w:tentative="1">
+      <w:start w:val="1"/>
+      <w:numFmt w:val="bullet"/>
+      <w:lvlText w:val=""/>
+      <w:lvlJc w:val="left"/>
+      <w:pPr>
+        <w:tabs>
+          <w:tab w:val="num" w:pos="5040"/>
+        </w:tabs>
+        <w:ind w:left="5040" w:hanging="360"/>
+      </w:pPr>
+      <w:rPr>
+        <w:rFonts w:ascii="Wingdings" w:hAnsi="Wingdings" w:hint="default"/>
+        <w:sz w:val="20"/>
+      </w:rPr>
+    </w:lvl>
+    <w:lvl w:ilvl="7" w:tentative="1">
+      <w:start w:val="1"/>
+      <w:numFmt w:val="bullet"/>
+      <w:lvlText w:val=""/>
+      <w:lvlJc w:val="left"/>
+      <w:pPr>
+        <w:tabs>
+          <w:tab w:val="num" w:pos="5760"/>
+        </w:tabs>
+        <w:ind w:left="5760" w:hanging="360"/>
+      </w:pPr>
+      <w:rPr>
+        <w:rFonts w:ascii="Wingdings" w:hAnsi="Wingdings" w:hint="default"/>
+        <w:sz w:val="20"/>
+      </w:rPr>
+    </w:lvl>
+    <w:lvl w:ilvl="8" w:tentative="1">
+      <w:start w:val="1"/>
+      <w:numFmt w:val="bullet"/>
+      <w:lvlText w:val=""/>
+      <w:lvlJc w:val="left"/>
+      <w:pPr>
+        <w:tabs>
+          <w:tab w:val="num" w:pos="6480"/>
+        </w:tabs>
+        <w:ind w:left="6480" w:hanging="360"/>
+      </w:pPr>
+      <w:rPr>
+        <w:rFonts w:ascii="Wingdings" w:hAnsi="Wingdings" w:hint="default"/>
+        <w:sz w:val="20"/>
+      </w:rPr>
+    </w:lvl>
+  </w:abstractNum>
+  <w:abstractNum w:abstractNumId="8" w15:restartNumberingAfterBreak="0">
     <w:nsid w:val="76487A28"/>
     <w:multiLevelType w:val="hybridMultilevel"/>
     <w:tmpl w:val="601ECE0C"/>
@@ -4726,13 +4987,16 @@
     <w:abstractNumId w:val="0"/>
   </w:num>
   <w:num w:numId="7" w16cid:durableId="1858885607">
-    <w:abstractNumId w:val="7"/>
+    <w:abstractNumId w:val="8"/>
   </w:num>
   <w:num w:numId="8" w16cid:durableId="1323000895">
     <w:abstractNumId w:val="2"/>
   </w:num>
   <w:num w:numId="9" w16cid:durableId="2083284349">
     <w:abstractNumId w:val="1"/>
+  </w:num>
+  <w:num w:numId="10" w16cid:durableId="915167126">
+    <w:abstractNumId w:val="7"/>
   </w:num>
   <w:numIdMacAtCleanup w:val="5"/>
 </w:numbering>

</xml_diff>